<commit_message>
Presentaciones Orlando y Tampa: versión del 27 oct con el ejemplo desglosado (42 diapositivas)
Co-Authored-By: Claude Opus 5.5 <noreply@anthropic.com>
Claude-Session: https://claude.ai/code/session_01YV28CAGs6ftmBuLybVXusw
</commit_message>
<xml_diff>
--- a/presentaciones/eventos-2026-10-orlando-tampa/Guion_Espana_sin_sorpresas_Tampa_ES.docx
+++ b/presentaciones/eventos-2026-10-orlando-tampa/Guion_Espana_sin_sorpresas_Tampa_ES.docx
@@ -2796,7 +2796,7 @@
           <w:color w:val="65736D"/>
           <w:sz w:val="17"/>
         </w:rPr>
-        <w:t xml:space="preserve">Diapositiva 25 · [30:21 — 32:05]  </w:t>
+        <w:t xml:space="preserve">Diapositiva 25 · [30:21 — 31:51]  </w:t>
       </w:r>
       <w:r>
         <w:rPr>
@@ -2804,7 +2804,7 @@
           <w:color w:val="1C3B34"/>
           <w:sz w:val="25"/>
         </w:rPr>
-        <w:t>Errores comunes · 1 de 2</w:t>
+        <w:t>La misma casa de 500.000 €, paso a paso</w:t>
       </w:r>
     </w:p>
     <w:p>
@@ -2813,7 +2813,7 @@
           <w:rFonts w:ascii="Arial" w:hAnsi="Arial" w:cs="Arial" w:eastAsia="Arial"/>
           <w:sz w:val="21"/>
         </w:rPr>
-        <w:t>Ahora, los errores que vemos cada semana. Yo leo la frase y ustedes me dicen: ¿sí o no?</w:t>
+        <w:t>Ahora la misma casa, con números. Valencia, segunda mano, quinientos mil euros, hipoteca del setenta por ciento.</w:t>
       </w:r>
     </w:p>
     <w:p>
@@ -2824,7 +2824,7 @@
           <w:color w:val="65736D"/>
           <w:sz w:val="19"/>
         </w:rPr>
-        <w:t>[Lee cada frase con la voz del cliente. Diviértete con el tono. Espera el «¡NO!» de la sala.]</w:t>
+        <w:t>[Columna izquierda, línea a línea.]</w:t>
       </w:r>
     </w:p>
     <w:p>
@@ -2833,7 +2833,7 @@
           <w:rFonts w:ascii="Arial" w:hAnsi="Arial" w:cs="Arial" w:eastAsia="Arial"/>
           <w:sz w:val="21"/>
         </w:rPr>
-        <w:t>«Primero encuentro la casa y luego ya veré la financiación.»</w:t>
+        <w:t>A la firma: entrada del treinta por ciento, ciento cincuenta mil. ITP al nueve por ciento, cuarenta y cinco mil. Notaría, unos mil quinientos. Registro, unos mil. Gestoría, unos quinientos. Tasación, unos cuatrocientos. Unos ciento noventa y ocho mil cuatrocientos euros.</w:t>
       </w:r>
     </w:p>
     <w:p>
@@ -2844,7 +2844,7 @@
           <w:color w:val="65736D"/>
           <w:sz w:val="19"/>
         </w:rPr>
-        <w:t>[Espera el «¡NO!»]</w:t>
+        <w:t>[Recuadro oscuro.]</w:t>
       </w:r>
     </w:p>
     <w:p>
@@ -2853,16 +2853,7 @@
           <w:rFonts w:ascii="Arial" w:hAnsi="Arial" w:cs="Arial" w:eastAsia="Arial"/>
           <w:sz w:val="21"/>
         </w:rPr>
-        <w:t>Exacto. Primero la financiación, porque la financiación define el presupuesto.</w:t>
-      </w:r>
-    </w:p>
-    <w:p>
-      <w:r>
-        <w:rPr>
-          <w:rFonts w:ascii="Arial" w:hAnsi="Arial" w:cs="Arial" w:eastAsia="Arial"/>
-          <w:sz w:val="21"/>
-        </w:rPr>
-        <w:t>«Mi banco en Estados Unidos dice que soy un gran cliente, así que en España irá todo sobre ruedas.»</w:t>
+        <w:t>La hipoteca: trescientos cincuenta mil a veinticinco años al tres y medio por ciento fijo. Unos mil setecientos cincuenta euros al mes.</w:t>
       </w:r>
     </w:p>
     <w:p>
@@ -2873,7 +2864,7 @@
           <w:color w:val="65736D"/>
           <w:sz w:val="19"/>
         </w:rPr>
-        <w:t>[¡NO!]</w:t>
+        <w:t>[Recuadro amarillo. Más despacio.]</w:t>
       </w:r>
     </w:p>
     <w:p>
@@ -2882,7 +2873,7 @@
           <w:rFonts w:ascii="Arial" w:hAnsi="Arial" w:cs="Arial" w:eastAsia="Arial"/>
           <w:sz w:val="21"/>
         </w:rPr>
-        <w:t>Un gran cliente en Estados Unidos no es automáticamente un buen expediente en España. Acabamos de ver por qué.</w:t>
+        <w:t>Y mi regla: contar siempre con un cinco por ciento adicional del precio para servicios. Unos veinticinco mil. Así que el dinero que hay que tener listo: unos doscientos veintitrés mil euros.</w:t>
       </w:r>
     </w:p>
     <w:p>
@@ -2891,94 +2882,7 @@
           <w:rFonts w:ascii="Arial" w:hAnsi="Arial" w:cs="Arial" w:eastAsia="Arial"/>
           <w:sz w:val="21"/>
         </w:rPr>
-        <w:t>«Si cuesta seiscientos mil, la tasación será de seiscientos mil, claro.»</w:t>
-      </w:r>
-    </w:p>
-    <w:p>
-      <w:r>
-        <w:rPr>
-          <w:rFonts w:ascii="Arial" w:hAnsi="Arial" w:cs="Arial" w:eastAsia="Arial"/>
-          <w:i/>
-          <w:color w:val="65736D"/>
-          <w:sz w:val="19"/>
-        </w:rPr>
-        <w:t>[¡NO!]</w:t>
-      </w:r>
-    </w:p>
-    <w:p>
-      <w:r>
-        <w:rPr>
-          <w:rFonts w:ascii="Arial" w:hAnsi="Arial" w:cs="Arial" w:eastAsia="Arial"/>
-          <w:sz w:val="21"/>
-        </w:rPr>
-        <w:t>La tasación puede salir más baja. Y la diferencia se paga en efectivo.</w:t>
-      </w:r>
-    </w:p>
-    <w:p>
-      <w:r>
-        <w:rPr>
-          <w:rFonts w:ascii="Arial" w:hAnsi="Arial" w:cs="Arial" w:eastAsia="Arial"/>
-          <w:sz w:val="21"/>
-        </w:rPr>
-        <w:t>«Tengo para la entrada, así que estoy cubierto.»</w:t>
-      </w:r>
-    </w:p>
-    <w:p>
-      <w:r>
-        <w:rPr>
-          <w:rFonts w:ascii="Arial" w:hAnsi="Arial" w:cs="Arial" w:eastAsia="Arial"/>
-          <w:i/>
-          <w:color w:val="65736D"/>
-          <w:sz w:val="19"/>
-        </w:rPr>
-        <w:t>[¡NO!]</w:t>
-      </w:r>
-    </w:p>
-    <w:p>
-      <w:r>
-        <w:rPr>
-          <w:rFonts w:ascii="Arial" w:hAnsi="Arial" w:cs="Arial" w:eastAsia="Arial"/>
-          <w:sz w:val="21"/>
-        </w:rPr>
-        <w:t>La entrada no es todo el dinero que hace falta. Los impuestos y los gastos van aparte.</w:t>
-      </w:r>
-    </w:p>
-    <w:p>
-      <w:r>
-        <w:rPr>
-          <w:rFonts w:ascii="Arial" w:hAnsi="Arial" w:cs="Arial" w:eastAsia="Arial"/>
-          <w:sz w:val="21"/>
-        </w:rPr>
-        <w:t>Y mi favorita: «La agencia me ha dicho que la hipoteca saldrá bien.»</w:t>
-      </w:r>
-    </w:p>
-    <w:p>
-      <w:r>
-        <w:rPr>
-          <w:rFonts w:ascii="Arial" w:hAnsi="Arial" w:cs="Arial" w:eastAsia="Arial"/>
-          <w:i/>
-          <w:color w:val="65736D"/>
-          <w:sz w:val="19"/>
-        </w:rPr>
-        <w:t>[Sonríe a la sala. Espera el «¡NO!»]</w:t>
-      </w:r>
-    </w:p>
-    <w:p>
-      <w:r>
-        <w:rPr>
-          <w:rFonts w:ascii="Arial" w:hAnsi="Arial" w:cs="Arial" w:eastAsia="Arial"/>
-          <w:sz w:val="21"/>
-        </w:rPr>
-        <w:t>Con todo el cariño del mundo: nadie puede prometer lo que hará un banco. El banco decide. Siempre. Lo que nosotros controlamos es todo lo que ocurre antes de esa decisión.</w:t>
-      </w:r>
-    </w:p>
-    <w:p>
-      <w:r>
-        <w:rPr>
-          <w:rFonts w:ascii="Arial" w:hAnsi="Arial" w:cs="Arial" w:eastAsia="Arial"/>
-          <w:sz w:val="21"/>
-        </w:rPr>
-        <w:t>Y la buena noticia está en la última tarjeta. Todo esto tiene arreglo, si alguien lo detecta antes de firmar.</w:t>
+        <w:t>Ejemplo ilustrativo, no es una oferta. Decide el banco, y el coste final depende de comisiones, seguros y productos vinculados. Los gastos de la escritura de la hipoteca los paga el banco.</w:t>
       </w:r>
     </w:p>
     <w:p>
@@ -3017,7 +2921,7 @@
           <w:color w:val="65736D"/>
           <w:sz w:val="17"/>
         </w:rPr>
-        <w:t xml:space="preserve">Diapositiva 26 · [32:05 — 34:05]  </w:t>
+        <w:t xml:space="preserve">Diapositiva 26 · [31:51 — 33:35]  </w:t>
       </w:r>
       <w:r>
         <w:rPr>
@@ -3025,7 +2929,7 @@
           <w:color w:val="1C3B34"/>
           <w:sz w:val="25"/>
         </w:rPr>
-        <w:t>Errores comunes · 2 de 2</w:t>
+        <w:t>Errores comunes · 1 de 2</w:t>
       </w:r>
     </w:p>
     <w:p>
@@ -3034,16 +2938,7 @@
           <w:rFonts w:ascii="Arial" w:hAnsi="Arial" w:cs="Arial" w:eastAsia="Arial"/>
           <w:sz w:val="21"/>
         </w:rPr>
-        <w:t>Mismo juego. Unos cuantos más.</w:t>
-      </w:r>
-    </w:p>
-    <w:p>
-      <w:r>
-        <w:rPr>
-          <w:rFonts w:ascii="Arial" w:hAnsi="Arial" w:cs="Arial" w:eastAsia="Arial"/>
-          <w:sz w:val="21"/>
-        </w:rPr>
-        <w:t>«Firmo la reserva ya y lo demás lo resuelvo después.»</w:t>
+        <w:t>Ahora, los errores que vemos cada semana. Yo leo la frase y ustedes me dicen: ¿sí o no?</w:t>
       </w:r>
     </w:p>
     <w:p>
@@ -3054,7 +2949,7 @@
           <w:color w:val="65736D"/>
           <w:sz w:val="19"/>
         </w:rPr>
-        <w:t>[¡NO!]</w:t>
+        <w:t>[Lee cada frase con la voz del cliente. Diviértete con el tono. Espera el «¡NO!» de la sala.]</w:t>
       </w:r>
     </w:p>
     <w:p>
@@ -3063,16 +2958,7 @@
           <w:rFonts w:ascii="Arial" w:hAnsi="Arial" w:cs="Arial" w:eastAsia="Arial"/>
           <w:sz w:val="21"/>
         </w:rPr>
-        <w:t>En España, las primeras firmas comprometen dinero. La reserva y las arras se pueden perder si la financiación no sale.</w:t>
-      </w:r>
-    </w:p>
-    <w:p>
-      <w:r>
-        <w:rPr>
-          <w:rFonts w:ascii="Arial" w:hAnsi="Arial" w:cs="Arial" w:eastAsia="Arial"/>
-          <w:sz w:val="21"/>
-        </w:rPr>
-        <w:t>«Iré directamente con mi banco.»</w:t>
+        <w:t>«Primero encuentro la casa y luego ya veré la financiación.»</w:t>
       </w:r>
     </w:p>
     <w:p>
@@ -3083,7 +2969,7 @@
           <w:color w:val="65736D"/>
           <w:sz w:val="19"/>
         </w:rPr>
-        <w:t>[¡NO!]</w:t>
+        <w:t>[Espera el «¡NO!»]</w:t>
       </w:r>
     </w:p>
     <w:p>
@@ -3092,7 +2978,7 @@
           <w:rFonts w:ascii="Arial" w:hAnsi="Arial" w:cs="Arial" w:eastAsia="Arial"/>
           <w:sz w:val="21"/>
         </w:rPr>
-        <w:t>Su banco americano normalmente no presta en España. Y un banco español es una sola opinión.</w:t>
+        <w:t>Exacto. Primero la financiación, porque la financiación define el presupuesto.</w:t>
       </w:r>
     </w:p>
     <w:p>
@@ -3101,7 +2987,7 @@
           <w:rFonts w:ascii="Arial" w:hAnsi="Arial" w:cs="Arial" w:eastAsia="Arial"/>
           <w:sz w:val="21"/>
         </w:rPr>
-        <w:t>«El tipo de interés más bajo tiene que ser la mejor hipoteca.»</w:t>
+        <w:t>«Mi banco en Estados Unidos dice que soy un gran cliente, así que en España irá todo sobre ruedas.»</w:t>
       </w:r>
     </w:p>
     <w:p>
@@ -3121,7 +3007,7 @@
           <w:rFonts w:ascii="Arial" w:hAnsi="Arial" w:cs="Arial" w:eastAsia="Arial"/>
           <w:sz w:val="21"/>
         </w:rPr>
-        <w:t>El tipo de portada no es todo el coste. Importan los productos vinculados, los seguros, las comisiones y las condiciones.</w:t>
+        <w:t>Un gran cliente en Estados Unidos no es automáticamente un buen expediente en España. Acabamos de ver por qué.</w:t>
       </w:r>
     </w:p>
     <w:p>
@@ -3130,7 +3016,7 @@
           <w:rFonts w:ascii="Arial" w:hAnsi="Arial" w:cs="Arial" w:eastAsia="Arial"/>
           <w:sz w:val="21"/>
         </w:rPr>
-        <w:t>«Si compro una casa, ya puedo vivir en España.»</w:t>
+        <w:t>«Si cuesta seiscientos mil, la tasación será de seiscientos mil, claro.»</w:t>
       </w:r>
     </w:p>
     <w:p>
@@ -3150,7 +3036,7 @@
           <w:rFonts w:ascii="Arial" w:hAnsi="Arial" w:cs="Arial" w:eastAsia="Arial"/>
           <w:sz w:val="21"/>
         </w:rPr>
-        <w:t>La residencia es un proyecto aparte.</w:t>
+        <w:t>La tasación puede salir más baja. Y la diferencia se paga en efectivo.</w:t>
       </w:r>
     </w:p>
     <w:p>
@@ -3159,7 +3045,7 @@
           <w:rFonts w:ascii="Arial" w:hAnsi="Arial" w:cs="Arial" w:eastAsia="Arial"/>
           <w:sz w:val="21"/>
         </w:rPr>
-        <w:t>«Con pasaporte europeo o visado, la hipoteca será más fácil.»</w:t>
+        <w:t>«Tengo para la entrada, así que estoy cubierto.»</w:t>
       </w:r>
     </w:p>
     <w:p>
@@ -3179,7 +3065,7 @@
           <w:rFonts w:ascii="Arial" w:hAnsi="Arial" w:cs="Arial" w:eastAsia="Arial"/>
           <w:sz w:val="21"/>
         </w:rPr>
-        <w:t>El banco mira ingresos, estabilidad y uso. No el pasaporte.</w:t>
+        <w:t>La entrada no es todo el dinero que hace falta. Los impuestos y los gastos van aparte.</w:t>
       </w:r>
     </w:p>
     <w:p>
@@ -3188,7 +3074,7 @@
           <w:rFonts w:ascii="Arial" w:hAnsi="Arial" w:cs="Arial" w:eastAsia="Arial"/>
           <w:sz w:val="21"/>
         </w:rPr>
-        <w:t>«Primero me mudo y pido la hipoteca cuando ya sea residente.»</w:t>
+        <w:t>Y mi favorita: «La agencia me ha dicho que la hipoteca saldrá bien.»</w:t>
       </w:r>
     </w:p>
     <w:p>
@@ -3199,7 +3085,7 @@
           <w:color w:val="65736D"/>
           <w:sz w:val="19"/>
         </w:rPr>
-        <w:t>[¡NO! O al menos: cuidado.]</w:t>
+        <w:t>[Sonríe a la sala. Espera el «¡NO!»]</w:t>
       </w:r>
     </w:p>
     <w:p>
@@ -3208,18 +3094,7 @@
           <w:rFonts w:ascii="Arial" w:hAnsi="Arial" w:cs="Arial" w:eastAsia="Arial"/>
           <w:sz w:val="21"/>
         </w:rPr>
-        <w:t>Si mudarse supone trabajo o empresa nuevos, el banco puede pedir otra vez dos o tres años fiscales. Muchas veces lo inteligente es comprar e hipotecar antes.</w:t>
-      </w:r>
-    </w:p>
-    <w:p>
-      <w:r>
-        <w:rPr>
-          <w:rFonts w:ascii="Arial" w:hAnsi="Arial" w:cs="Arial" w:eastAsia="Arial"/>
-          <w:i/>
-          <w:color w:val="65736D"/>
-          <w:sz w:val="19"/>
-        </w:rPr>
-        <w:t>[Señalar la pantalla. Más despacio.]</w:t>
+        <w:t>Con todo el cariño del mundo: nadie puede prometer lo que hará un banco. El banco decide. Siempre. Lo que nosotros controlamos es todo lo que ocurre antes de esa decisión.</w:t>
       </w:r>
     </w:p>
     <w:p>
@@ -3228,7 +3103,7 @@
           <w:rFonts w:ascii="Arial" w:hAnsi="Arial" w:cs="Arial" w:eastAsia="Arial"/>
           <w:sz w:val="21"/>
         </w:rPr>
-        <w:t>Claridad antes de comprometerse.</w:t>
+        <w:t>Y la buena noticia está en la última tarjeta. Todo esto tiene arreglo, si alguien lo detecta antes de firmar.</w:t>
       </w:r>
     </w:p>
     <w:p>
@@ -3267,7 +3142,7 @@
           <w:color w:val="65736D"/>
           <w:sz w:val="17"/>
         </w:rPr>
-        <w:t xml:space="preserve">Diapositiva 27 · [34:05 — 35:15]  </w:t>
+        <w:t xml:space="preserve">Diapositiva 27 · [33:35 — 35:35]  </w:t>
       </w:r>
       <w:r>
         <w:rPr>
@@ -3275,7 +3150,7 @@
           <w:color w:val="1C3B34"/>
           <w:sz w:val="25"/>
         </w:rPr>
-        <w:t>Preguntas rápidas · parte 1</w:t>
+        <w:t>Errores comunes · 2 de 2</w:t>
       </w:r>
     </w:p>
     <w:p>
@@ -3284,7 +3159,7 @@
           <w:rFonts w:ascii="Arial" w:hAnsi="Arial" w:cs="Arial" w:eastAsia="Arial"/>
           <w:sz w:val="21"/>
         </w:rPr>
-        <w:t>Preguntas rápidas. Yo leo, ustedes adivinan, yo revelo. ¿Listos?</w:t>
+        <w:t>Mismo juego. Unos cuantos más.</w:t>
       </w:r>
     </w:p>
     <w:p>
@@ -3293,7 +3168,18 @@
           <w:rFonts w:ascii="Arial" w:hAnsi="Arial" w:cs="Arial" w:eastAsia="Arial"/>
           <w:sz w:val="21"/>
         </w:rPr>
-        <w:t>¿Puede un extranjero comprar vivienda en España? Sí.</w:t>
+        <w:t>«Firmo la reserva ya y lo demás lo resuelvo después.»</w:t>
+      </w:r>
+    </w:p>
+    <w:p>
+      <w:r>
+        <w:rPr>
+          <w:rFonts w:ascii="Arial" w:hAnsi="Arial" w:cs="Arial" w:eastAsia="Arial"/>
+          <w:i/>
+          <w:color w:val="65736D"/>
+          <w:sz w:val="19"/>
+        </w:rPr>
+        <w:t>[¡NO!]</w:t>
       </w:r>
     </w:p>
     <w:p>
@@ -3302,7 +3188,7 @@
           <w:rFonts w:ascii="Arial" w:hAnsi="Arial" w:cs="Arial" w:eastAsia="Arial"/>
           <w:sz w:val="21"/>
         </w:rPr>
-        <w:t>¿Tiene que ser residente? No.</w:t>
+        <w:t>En España, las primeras firmas comprometen dinero. La reserva y las arras se pueden perder si la financiación no sale.</w:t>
       </w:r>
     </w:p>
     <w:p>
@@ -3311,7 +3197,18 @@
           <w:rFonts w:ascii="Arial" w:hAnsi="Arial" w:cs="Arial" w:eastAsia="Arial"/>
           <w:sz w:val="21"/>
         </w:rPr>
-        <w:t>¿Comprar una vivienda le da la residencia? No. Miren, ya son expertos.</w:t>
+        <w:t>«Iré directamente con mi banco.»</w:t>
+      </w:r>
+    </w:p>
+    <w:p>
+      <w:r>
+        <w:rPr>
+          <w:rFonts w:ascii="Arial" w:hAnsi="Arial" w:cs="Arial" w:eastAsia="Arial"/>
+          <w:i/>
+          <w:color w:val="65736D"/>
+          <w:sz w:val="19"/>
+        </w:rPr>
+        <w:t>[¡NO!]</w:t>
       </w:r>
     </w:p>
     <w:p>
@@ -3320,7 +3217,7 @@
           <w:rFonts w:ascii="Arial" w:hAnsi="Arial" w:cs="Arial" w:eastAsia="Arial"/>
           <w:sz w:val="21"/>
         </w:rPr>
-        <w:t>¿Hipoteca española con ingresos en dólares? Es posible. Con el banco adecuado y un expediente bien construido.</w:t>
+        <w:t>Su banco americano normalmente no presta en España. Y un banco español es una sola opinión.</w:t>
       </w:r>
     </w:p>
     <w:p>
@@ -3329,7 +3226,18 @@
           <w:rFonts w:ascii="Arial" w:hAnsi="Arial" w:cs="Arial" w:eastAsia="Arial"/>
           <w:sz w:val="21"/>
         </w:rPr>
-        <w:t>¿Y si tiene pasaporte europeo? Facilita vivir aquí. No facilita la hipoteca. Hola otra vez, abuela italiana.</w:t>
+        <w:t>«El tipo de interés más bajo tiene que ser la mejor hipoteca.»</w:t>
+      </w:r>
+    </w:p>
+    <w:p>
+      <w:r>
+        <w:rPr>
+          <w:rFonts w:ascii="Arial" w:hAnsi="Arial" w:cs="Arial" w:eastAsia="Arial"/>
+          <w:i/>
+          <w:color w:val="65736D"/>
+          <w:sz w:val="19"/>
+        </w:rPr>
+        <w:t>[¡NO!]</w:t>
       </w:r>
     </w:p>
     <w:p>
@@ -3338,7 +3246,135 @@
           <w:rFonts w:ascii="Arial" w:hAnsi="Arial" w:cs="Arial" w:eastAsia="Arial"/>
           <w:sz w:val="21"/>
         </w:rPr>
-        <w:t>¿Necesita NIE? Sí, para comprar. Sin NIE, no hay operación.</w:t>
+        <w:t>El tipo de portada no es todo el coste. Importan los productos vinculados, los seguros, las comisiones y las condiciones.</w:t>
+      </w:r>
+    </w:p>
+    <w:p>
+      <w:r>
+        <w:rPr>
+          <w:rFonts w:ascii="Arial" w:hAnsi="Arial" w:cs="Arial" w:eastAsia="Arial"/>
+          <w:sz w:val="21"/>
+        </w:rPr>
+        <w:t>«Si compro una casa, ya puedo vivir en España.»</w:t>
+      </w:r>
+    </w:p>
+    <w:p>
+      <w:r>
+        <w:rPr>
+          <w:rFonts w:ascii="Arial" w:hAnsi="Arial" w:cs="Arial" w:eastAsia="Arial"/>
+          <w:i/>
+          <w:color w:val="65736D"/>
+          <w:sz w:val="19"/>
+        </w:rPr>
+        <w:t>[¡NO!]</w:t>
+      </w:r>
+    </w:p>
+    <w:p>
+      <w:r>
+        <w:rPr>
+          <w:rFonts w:ascii="Arial" w:hAnsi="Arial" w:cs="Arial" w:eastAsia="Arial"/>
+          <w:sz w:val="21"/>
+        </w:rPr>
+        <w:t>La residencia es un proyecto aparte.</w:t>
+      </w:r>
+    </w:p>
+    <w:p>
+      <w:r>
+        <w:rPr>
+          <w:rFonts w:ascii="Arial" w:hAnsi="Arial" w:cs="Arial" w:eastAsia="Arial"/>
+          <w:sz w:val="21"/>
+        </w:rPr>
+        <w:t>«Con pasaporte europeo o visado, la hipoteca será más fácil.»</w:t>
+      </w:r>
+    </w:p>
+    <w:p>
+      <w:r>
+        <w:rPr>
+          <w:rFonts w:ascii="Arial" w:hAnsi="Arial" w:cs="Arial" w:eastAsia="Arial"/>
+          <w:i/>
+          <w:color w:val="65736D"/>
+          <w:sz w:val="19"/>
+        </w:rPr>
+        <w:t>[¡NO!]</w:t>
+      </w:r>
+    </w:p>
+    <w:p>
+      <w:r>
+        <w:rPr>
+          <w:rFonts w:ascii="Arial" w:hAnsi="Arial" w:cs="Arial" w:eastAsia="Arial"/>
+          <w:sz w:val="21"/>
+        </w:rPr>
+        <w:t>El banco mira ingresos, estabilidad y uso. No el pasaporte.</w:t>
+      </w:r>
+    </w:p>
+    <w:p>
+      <w:r>
+        <w:rPr>
+          <w:rFonts w:ascii="Arial" w:hAnsi="Arial" w:cs="Arial" w:eastAsia="Arial"/>
+          <w:sz w:val="21"/>
+        </w:rPr>
+        <w:t>«Primero me mudo y pido la hipoteca cuando ya sea residente.»</w:t>
+      </w:r>
+    </w:p>
+    <w:p>
+      <w:r>
+        <w:rPr>
+          <w:rFonts w:ascii="Arial" w:hAnsi="Arial" w:cs="Arial" w:eastAsia="Arial"/>
+          <w:i/>
+          <w:color w:val="65736D"/>
+          <w:sz w:val="19"/>
+        </w:rPr>
+        <w:t>[¡NO! O al menos: cuidado.]</w:t>
+      </w:r>
+    </w:p>
+    <w:p>
+      <w:r>
+        <w:rPr>
+          <w:rFonts w:ascii="Arial" w:hAnsi="Arial" w:cs="Arial" w:eastAsia="Arial"/>
+          <w:sz w:val="21"/>
+        </w:rPr>
+        <w:t>Si mudarse supone trabajo o empresa nuevos, el banco puede pedir otra vez dos o tres años fiscales. Muchas veces lo inteligente es comprar e hipotecar antes.</w:t>
+      </w:r>
+    </w:p>
+    <w:p>
+      <w:r>
+        <w:rPr>
+          <w:rFonts w:ascii="Arial" w:hAnsi="Arial" w:cs="Arial" w:eastAsia="Arial"/>
+          <w:i/>
+          <w:color w:val="65736D"/>
+          <w:sz w:val="19"/>
+        </w:rPr>
+        <w:t>[Señalar la pantalla. Más despacio.]</w:t>
+      </w:r>
+    </w:p>
+    <w:p>
+      <w:r>
+        <w:rPr>
+          <w:rFonts w:ascii="Arial" w:hAnsi="Arial" w:cs="Arial" w:eastAsia="Arial"/>
+          <w:sz w:val="21"/>
+        </w:rPr>
+        <w:t>Claridad antes de comprometerse.</w:t>
+      </w:r>
+    </w:p>
+    <w:p>
+      <w:pPr>
+        <w:pBdr>
+          <w:top w:val="single" w:sz="8" w:space="4" w:color="C9A227"/>
+          <w:left w:val="single" w:sz="8" w:space="4" w:color="C9A227"/>
+          <w:bottom w:val="single" w:sz="8" w:space="4" w:color="C9A227"/>
+          <w:right w:val="single" w:sz="8" w:space="4" w:color="C9A227"/>
+        </w:pBdr>
+        <w:shd w:val="clear" w:color="auto" w:fill="FBF7D4"/>
+        <w:spacing w:before="40"/>
+      </w:pPr>
+      <w:r>
+        <w:rPr>
+          <w:rFonts w:ascii="Arial" w:hAnsi="Arial" w:cs="Arial" w:eastAsia="Arial"/>
+          <w:b/>
+          <w:color w:val="1C3B34"/>
+          <w:sz w:val="17"/>
+        </w:rPr>
+        <w:t>Nota al margen: ⚠️ LCCI/Orden EHA/2899/2011 — verificar antes de publicar</w:t>
       </w:r>
     </w:p>
     <w:p>
@@ -3356,7 +3392,7 @@
           <w:color w:val="65736D"/>
           <w:sz w:val="17"/>
         </w:rPr>
-        <w:t xml:space="preserve">Diapositiva 28 · [35:15 — 36:07]  </w:t>
+        <w:t xml:space="preserve">Diapositiva 28 · [35:35 — 36:45]  </w:t>
       </w:r>
       <w:r>
         <w:rPr>
@@ -3364,7 +3400,7 @@
           <w:color w:val="1C3B34"/>
           <w:sz w:val="25"/>
         </w:rPr>
-        <w:t>Preguntas rápidas · parte 2</w:t>
+        <w:t>Preguntas rápidas · parte 1</w:t>
       </w:r>
     </w:p>
     <w:p>
@@ -3373,7 +3409,7 @@
           <w:rFonts w:ascii="Arial" w:hAnsi="Arial" w:cs="Arial" w:eastAsia="Arial"/>
           <w:sz w:val="21"/>
         </w:rPr>
-        <w:t>Segunda parte. No se me queden atrás.</w:t>
+        <w:t>Preguntas rápidas. Yo leo, ustedes adivinan, yo revelo. ¿Listos?</w:t>
       </w:r>
     </w:p>
     <w:p>
@@ -3382,7 +3418,7 @@
           <w:rFonts w:ascii="Arial" w:hAnsi="Arial" w:cs="Arial" w:eastAsia="Arial"/>
           <w:sz w:val="21"/>
         </w:rPr>
-        <w:t>¿Puede comprar a través de una sociedad? Quizá. Pero cambian la financiación, los impuestos y los costes, así que hay que analizarlo antes.</w:t>
+        <w:t>¿Puede un extranjero comprar vivienda en España? Sí.</w:t>
       </w:r>
     </w:p>
     <w:p>
@@ -3391,7 +3427,7 @@
           <w:rFonts w:ascii="Arial" w:hAnsi="Arial" w:cs="Arial" w:eastAsia="Arial"/>
           <w:sz w:val="21"/>
         </w:rPr>
-        <w:t>¿Puede alquilar la vivienda? Depende. Las normas del alquiler turístico dependen de la comunidad autónoma y del municipio, y cambian. Importan la zona, la licencia y el uso.</w:t>
+        <w:t>¿Tiene que ser residente? No.</w:t>
       </w:r>
     </w:p>
     <w:p>
@@ -3400,7 +3436,7 @@
           <w:rFonts w:ascii="Arial" w:hAnsi="Arial" w:cs="Arial" w:eastAsia="Arial"/>
           <w:sz w:val="21"/>
         </w:rPr>
-        <w:t>¿Hay que revisar una nota simple reciente? Siempre, antes de firmar. Dice quién es el titular y qué cargas tiene la vivienda.</w:t>
+        <w:t>¿Comprar una vivienda le da la residencia? No. Miren, ya son expertos.</w:t>
       </w:r>
     </w:p>
     <w:p>
@@ -3409,7 +3445,7 @@
           <w:rFonts w:ascii="Arial" w:hAnsi="Arial" w:cs="Arial" w:eastAsia="Arial"/>
           <w:sz w:val="21"/>
         </w:rPr>
-        <w:t>¿Puede firmar sin viajar a España? Sí. Con un poder notarial, bien planificado.</w:t>
+        <w:t>¿Hipoteca española con ingresos en dólares? Es posible. Con el banco adecuado y un expediente bien construido.</w:t>
       </w:r>
     </w:p>
     <w:p>
@@ -3418,18 +3454,7 @@
           <w:rFonts w:ascii="Arial" w:hAnsi="Arial" w:cs="Arial" w:eastAsia="Arial"/>
           <w:sz w:val="21"/>
         </w:rPr>
-        <w:t>Y la última. ¿Hay que analizar la financiación antes de reservar una vivienda?</w:t>
-      </w:r>
-    </w:p>
-    <w:p>
-      <w:r>
-        <w:rPr>
-          <w:rFonts w:ascii="Arial" w:hAnsi="Arial" w:cs="Arial" w:eastAsia="Arial"/>
-          <w:i/>
-          <w:color w:val="65736D"/>
-          <w:sz w:val="19"/>
-        </w:rPr>
-        <w:t>[Final fuerte. Deja que la sala lo grite.]</w:t>
+        <w:t>¿Y si tiene pasaporte europeo? Facilita vivir aquí. No facilita la hipoteca. Hola otra vez, abuela italiana.</w:t>
       </w:r>
     </w:p>
     <w:p>
@@ -3438,7 +3463,7 @@
           <w:rFonts w:ascii="Arial" w:hAnsi="Arial" w:cs="Arial" w:eastAsia="Arial"/>
           <w:sz w:val="21"/>
         </w:rPr>
-        <w:t>¡SIEMPRE!</w:t>
+        <w:t>¿Necesita NIE? Sí, para comprar. Sin NIE, no hay operación.</w:t>
       </w:r>
     </w:p>
     <w:p>
@@ -3456,7 +3481,7 @@
           <w:color w:val="65736D"/>
           <w:sz w:val="17"/>
         </w:rPr>
-        <w:t xml:space="preserve">Diapositiva 29 · [36:07 — 36:59]  </w:t>
+        <w:t xml:space="preserve">Diapositiva 29 · [36:45 — 37:37]  </w:t>
       </w:r>
       <w:r>
         <w:rPr>
@@ -3464,7 +3489,7 @@
           <w:color w:val="1C3B34"/>
           <w:sz w:val="25"/>
         </w:rPr>
-        <w:t>Hacia dónde va Dream Nest</w:t>
+        <w:t>Preguntas rápidas · parte 2</w:t>
       </w:r>
     </w:p>
     <w:p>
@@ -3473,7 +3498,7 @@
           <w:rFonts w:ascii="Arial" w:hAnsi="Arial" w:cs="Arial" w:eastAsia="Arial"/>
           <w:sz w:val="21"/>
         </w:rPr>
-        <w:t>Les cuento hacia dónde va Dream Nest.</w:t>
+        <w:t>Segunda parte. No se me queden atrás.</w:t>
       </w:r>
     </w:p>
     <w:p>
@@ -3482,7 +3507,7 @@
           <w:rFonts w:ascii="Arial" w:hAnsi="Arial" w:cs="Arial" w:eastAsia="Arial"/>
           <w:sz w:val="21"/>
         </w:rPr>
-        <w:t>Estamos invirtiendo en serio en tecnología. Pero creemos que comprar una casa en otro país nunca debería convertirse en un proceso automático.</w:t>
+        <w:t>¿Puede comprar a través de una sociedad? Quizá. Pero cambian la financiación, los impuestos y los costes, así que hay que analizarlo antes.</w:t>
       </w:r>
     </w:p>
     <w:p>
@@ -3491,7 +3516,7 @@
           <w:rFonts w:ascii="Arial" w:hAnsi="Arial" w:cs="Arial" w:eastAsia="Arial"/>
           <w:sz w:val="21"/>
         </w:rPr>
-        <w:t>La tecnología debe complementar la relación humana. Nunca sustituirla.</w:t>
+        <w:t>¿Puede alquilar la vivienda? Depende. Las normas del alquiler turístico dependen de la comunidad autónoma y del municipio, y cambian. Importan la zona, la licencia y el uso.</w:t>
       </w:r>
     </w:p>
     <w:p>
@@ -3500,7 +3525,7 @@
           <w:rFonts w:ascii="Arial" w:hAnsi="Arial" w:cs="Arial" w:eastAsia="Arial"/>
           <w:sz w:val="21"/>
         </w:rPr>
-        <w:t>Así que la usamos para lo que hace que el cliente se sienta acompañado. Ve dónde está, qué falta y qué viene después. Los documentos son fáciles. Nadie repite los mismos datos tres veces. Menos errores. Explicaciones más claras. Tareas con antelación.</w:t>
+        <w:t>¿Hay que revisar una nota simple reciente? Siempre, antes de firmar. Dice quién es el titular y qué cargas tiene la vivienda.</w:t>
       </w:r>
     </w:p>
     <w:p>
@@ -3509,7 +3534,36 @@
           <w:rFonts w:ascii="Arial" w:hAnsi="Arial" w:cs="Arial" w:eastAsia="Arial"/>
           <w:sz w:val="21"/>
         </w:rPr>
-        <w:t>Y siempre, siempre, hay una persona real que responde. Una conversación real. Un equipo real detrás de la tecnología.</w:t>
+        <w:t>¿Puede firmar sin viajar a España? Sí. Con un poder notarial, bien planificado.</w:t>
+      </w:r>
+    </w:p>
+    <w:p>
+      <w:r>
+        <w:rPr>
+          <w:rFonts w:ascii="Arial" w:hAnsi="Arial" w:cs="Arial" w:eastAsia="Arial"/>
+          <w:sz w:val="21"/>
+        </w:rPr>
+        <w:t>Y la última. ¿Hay que analizar la financiación antes de reservar una vivienda?</w:t>
+      </w:r>
+    </w:p>
+    <w:p>
+      <w:r>
+        <w:rPr>
+          <w:rFonts w:ascii="Arial" w:hAnsi="Arial" w:cs="Arial" w:eastAsia="Arial"/>
+          <w:i/>
+          <w:color w:val="65736D"/>
+          <w:sz w:val="19"/>
+        </w:rPr>
+        <w:t>[Final fuerte. Deja que la sala lo grite.]</w:t>
+      </w:r>
+    </w:p>
+    <w:p>
+      <w:r>
+        <w:rPr>
+          <w:rFonts w:ascii="Arial" w:hAnsi="Arial" w:cs="Arial" w:eastAsia="Arial"/>
+          <w:sz w:val="21"/>
+        </w:rPr>
+        <w:t>¡SIEMPRE!</w:t>
       </w:r>
     </w:p>
     <w:p>
@@ -3527,7 +3581,7 @@
           <w:color w:val="65736D"/>
           <w:sz w:val="17"/>
         </w:rPr>
-        <w:t xml:space="preserve">Diapositiva 30 · [36:59 — 38:09]  </w:t>
+        <w:t xml:space="preserve">Diapositiva 30 · [37:37 — 38:29]  </w:t>
       </w:r>
       <w:r>
         <w:rPr>
@@ -3535,7 +3589,7 @@
           <w:color w:val="1C3B34"/>
           <w:sz w:val="25"/>
         </w:rPr>
-        <w:t>My Dream Nest · para clientes</w:t>
+        <w:t>Hacia dónde va Dream Nest</w:t>
       </w:r>
     </w:p>
     <w:p>
@@ -3544,18 +3598,7 @@
           <w:rFonts w:ascii="Arial" w:hAnsi="Arial" w:cs="Arial" w:eastAsia="Arial"/>
           <w:sz w:val="21"/>
         </w:rPr>
-        <w:t>Esta es My Dream Nest, nuestra app para clientes. Se la enseño como le enseñaría el teléfono a un amigo.</w:t>
-      </w:r>
-    </w:p>
-    <w:p>
-      <w:r>
-        <w:rPr>
-          <w:rFonts w:ascii="Arial" w:hAnsi="Arial" w:cs="Arial" w:eastAsia="Arial"/>
-          <w:i/>
-          <w:color w:val="65736D"/>
-          <w:sz w:val="19"/>
-        </w:rPr>
-        <w:t>[Señala las pantallas.]</w:t>
+        <w:t>Les cuento hacia dónde va Dream Nest.</w:t>
       </w:r>
     </w:p>
     <w:p>
@@ -3564,7 +3607,7 @@
           <w:rFonts w:ascii="Arial" w:hAnsi="Arial" w:cs="Arial" w:eastAsia="Arial"/>
           <w:sz w:val="21"/>
         </w:rPr>
-        <w:t>El camino a casa: cada etapa, a la vista. ¿Dónde estoy? ¿Qué viene ahora?</w:t>
+        <w:t>Estamos invirtiendo en serio en tecnología. Pero creemos que comprar una casa en otro país nunca debería convertirse en un proceso automático.</w:t>
       </w:r>
     </w:p>
     <w:p>
@@ -3573,7 +3616,7 @@
           <w:rFonts w:ascii="Arial" w:hAnsi="Arial" w:cs="Arial" w:eastAsia="Arial"/>
           <w:sz w:val="21"/>
         </w:rPr>
-        <w:t>Documentos: qué está y qué falta. Se acabó el «¿te llegó mi correo?».</w:t>
+        <w:t>La tecnología debe complementar la relación humana. Nunca sustituirla.</w:t>
       </w:r>
     </w:p>
     <w:p>
@@ -3582,7 +3625,7 @@
           <w:rFonts w:ascii="Arial" w:hAnsi="Arial" w:cs="Arial" w:eastAsia="Arial"/>
           <w:sz w:val="21"/>
         </w:rPr>
-        <w:t>Sus números: para que el cliente entienda la financiación, lo que tiene que aportar y los gastos, en lenguaje claro.</w:t>
+        <w:t>Así que la usamos para lo que hace que el cliente se sienta acompañado. Ve dónde está, qué falta y qué viene después. Los documentos son fáciles. Nadie repite los mismos datos tres veces. Menos errores. Explicaciones más claras. Tareas con antelación.</w:t>
       </w:r>
     </w:p>
     <w:p>
@@ -3591,43 +3634,7 @@
           <w:rFonts w:ascii="Arial" w:hAnsi="Arial" w:cs="Arial" w:eastAsia="Arial"/>
           <w:sz w:val="21"/>
         </w:rPr>
-        <w:t>Y esta me encanta. «¿Has encontrado casa?» El cliente comparte un anuncio y pregunta: «¿Me la puedo permitir?» Y una persona de nuestro equipo lo mira.</w:t>
-      </w:r>
-    </w:p>
-    <w:p>
-      <w:r>
-        <w:rPr>
-          <w:rFonts w:ascii="Arial" w:hAnsi="Arial" w:cs="Arial" w:eastAsia="Arial"/>
-          <w:sz w:val="21"/>
-        </w:rPr>
-        <w:t>Tareas: exactamente qué hacer después.</w:t>
-      </w:r>
-    </w:p>
-    <w:p>
-      <w:r>
-        <w:rPr>
-          <w:rFonts w:ascii="Arial" w:hAnsi="Arial" w:cs="Arial" w:eastAsia="Arial"/>
-          <w:sz w:val="21"/>
-        </w:rPr>
-        <w:t>Su equipo Dream Nest: las personas reales que llevan el caso, con nombre y cara.</w:t>
-      </w:r>
-    </w:p>
-    <w:p>
-      <w:r>
-        <w:rPr>
-          <w:rFonts w:ascii="Arial" w:hAnsi="Arial" w:cs="Arial" w:eastAsia="Arial"/>
-          <w:sz w:val="21"/>
-        </w:rPr>
-        <w:t>Y voy a ser clara con los plazos. Algunas funciones, como la información integrada de la vivienda y del Registro, se están desplegando poco a poco.</w:t>
-      </w:r>
-    </w:p>
-    <w:p>
-      <w:r>
-        <w:rPr>
-          <w:rFonts w:ascii="Arial" w:hAnsi="Arial" w:cs="Arial" w:eastAsia="Arial"/>
-          <w:sz w:val="21"/>
-        </w:rPr>
-        <w:t>Son pantallas reales de la app. Claridad digital. Acompañamiento humano.</w:t>
+        <w:t>Y siempre, siempre, hay una persona real que responde. Una conversación real. Un equipo real detrás de la tecnología.</w:t>
       </w:r>
     </w:p>
     <w:p>
@@ -3645,7 +3652,7 @@
           <w:color w:val="65736D"/>
           <w:sz w:val="17"/>
         </w:rPr>
-        <w:t xml:space="preserve">Diapositiva 31 · [38:09 — 39:19]  </w:t>
+        <w:t xml:space="preserve">Diapositiva 31 · [38:29 — 39:39]  </w:t>
       </w:r>
       <w:r>
         <w:rPr>
@@ -3653,7 +3660,7 @@
           <w:color w:val="1C3B34"/>
           <w:sz w:val="25"/>
         </w:rPr>
-        <w:t>Para ustedes, los REALTORS®</w:t>
+        <w:t>My Dream Nest · para clientes</w:t>
       </w:r>
     </w:p>
     <w:p>
@@ -3662,34 +3669,7 @@
           <w:rFonts w:ascii="Arial" w:hAnsi="Arial" w:cs="Arial" w:eastAsia="Arial"/>
           <w:sz w:val="21"/>
         </w:rPr>
-        <w:t>Y esta es para ustedes.</w:t>
-      </w:r>
-    </w:p>
-    <w:p>
-      <w:r>
-        <w:rPr>
-          <w:rFonts w:ascii="Arial" w:hAnsi="Arial" w:cs="Arial" w:eastAsia="Arial"/>
-          <w:sz w:val="21"/>
-        </w:rPr>
-        <w:t>Nos presentan a un cliente... ¿y luego qué? Normalmente, silencio. Se preguntan si alguien le habrá llamado. Y no quieren ser quienes persiguen.</w:t>
-      </w:r>
-    </w:p>
-    <w:p>
-      <w:r>
-        <w:rPr>
-          <w:rFonts w:ascii="Arial" w:hAnsi="Arial" w:cs="Arial" w:eastAsia="Arial"/>
-          <w:sz w:val="21"/>
-        </w:rPr>
-        <w:t>Nosotros queremos justo lo contrario.</w:t>
-      </w:r>
-    </w:p>
-    <w:p>
-      <w:r>
-        <w:rPr>
-          <w:rFonts w:ascii="Arial" w:hAnsi="Arial" w:cs="Arial" w:eastAsia="Arial"/>
-          <w:sz w:val="21"/>
-        </w:rPr>
-        <w:t>Por eso hemos hecho la app de colaboradores. Ya está en marcha. Nos presentan a un cliente en segundos. Ven cómo avanza cada cliente, en sus dos caminos: la hipoteca y la vivienda. Saben cuándo hemos contactado con él. Tienen una lista de documentos por país para sus clientes, su propia página para compartir, y recursos sobre España y juegos. Y están informados sin perseguir a nadie.</w:t>
+        <w:t>Esta es My Dream Nest, nuestra app para clientes. Se la enseño como le enseñaría el teléfono a un amigo.</w:t>
       </w:r>
     </w:p>
     <w:p>
@@ -3700,18 +3680,7 @@
           <w:color w:val="65736D"/>
           <w:sz w:val="19"/>
         </w:rPr>
-        <w:t>[Señalar los móviles: pantallas reales, datos de demostración.]</w:t>
-      </w:r>
-    </w:p>
-    <w:p>
-      <w:r>
-        <w:rPr>
-          <w:rFonts w:ascii="Arial" w:hAnsi="Arial" w:cs="Arial" w:eastAsia="Arial"/>
-          <w:i/>
-          <w:color w:val="65736D"/>
-          <w:sz w:val="19"/>
-        </w:rPr>
-        <w:t>[Despacio. Con firmeza.]</w:t>
+        <w:t>[Señala las pantallas.]</w:t>
       </w:r>
     </w:p>
     <w:p>
@@ -3720,7 +3689,7 @@
           <w:rFonts w:ascii="Arial" w:hAnsi="Arial" w:cs="Arial" w:eastAsia="Arial"/>
           <w:sz w:val="21"/>
         </w:rPr>
-        <w:t>Y hay una línea roja. La información financiera de su cliente es privada. Nunca compartimos sus ingresos, su patrimonio, sus deudas, sus documentos bancarios ni su información crediticia.</w:t>
+        <w:t>El camino a casa: cada etapa, a la vista. ¿Dónde estoy? ¿Qué viene ahora?</w:t>
       </w:r>
     </w:p>
     <w:p>
@@ -3729,7 +3698,7 @@
           <w:rFonts w:ascii="Arial" w:hAnsi="Arial" w:cs="Arial" w:eastAsia="Arial"/>
           <w:sz w:val="21"/>
         </w:rPr>
-        <w:t>Ustedes ven el servicio. No sus finanzas.</w:t>
+        <w:t>Documentos: qué está y qué falta. Se acabó el «¿te llegó mi correo?».</w:t>
       </w:r>
     </w:p>
     <w:p>
@@ -3738,7 +3707,52 @@
           <w:rFonts w:ascii="Arial" w:hAnsi="Arial" w:cs="Arial" w:eastAsia="Arial"/>
           <w:sz w:val="21"/>
         </w:rPr>
-        <w:t>Eso protege a su cliente. Y, sinceramente, también protege la relación que ustedes tienen con él.</w:t>
+        <w:t>Sus números: para que el cliente entienda la financiación, lo que tiene que aportar y los gastos, en lenguaje claro.</w:t>
+      </w:r>
+    </w:p>
+    <w:p>
+      <w:r>
+        <w:rPr>
+          <w:rFonts w:ascii="Arial" w:hAnsi="Arial" w:cs="Arial" w:eastAsia="Arial"/>
+          <w:sz w:val="21"/>
+        </w:rPr>
+        <w:t>Y esta me encanta. «¿Has encontrado casa?» El cliente comparte un anuncio y pregunta: «¿Me la puedo permitir?» Y una persona de nuestro equipo lo mira.</w:t>
+      </w:r>
+    </w:p>
+    <w:p>
+      <w:r>
+        <w:rPr>
+          <w:rFonts w:ascii="Arial" w:hAnsi="Arial" w:cs="Arial" w:eastAsia="Arial"/>
+          <w:sz w:val="21"/>
+        </w:rPr>
+        <w:t>Tareas: exactamente qué hacer después.</w:t>
+      </w:r>
+    </w:p>
+    <w:p>
+      <w:r>
+        <w:rPr>
+          <w:rFonts w:ascii="Arial" w:hAnsi="Arial" w:cs="Arial" w:eastAsia="Arial"/>
+          <w:sz w:val="21"/>
+        </w:rPr>
+        <w:t>Su equipo Dream Nest: las personas reales que llevan el caso, con nombre y cara.</w:t>
+      </w:r>
+    </w:p>
+    <w:p>
+      <w:r>
+        <w:rPr>
+          <w:rFonts w:ascii="Arial" w:hAnsi="Arial" w:cs="Arial" w:eastAsia="Arial"/>
+          <w:sz w:val="21"/>
+        </w:rPr>
+        <w:t>Y voy a ser clara con los plazos. Algunas funciones, como la información integrada de la vivienda y del Registro, se están desplegando poco a poco.</w:t>
+      </w:r>
+    </w:p>
+    <w:p>
+      <w:r>
+        <w:rPr>
+          <w:rFonts w:ascii="Arial" w:hAnsi="Arial" w:cs="Arial" w:eastAsia="Arial"/>
+          <w:sz w:val="21"/>
+        </w:rPr>
+        <w:t>Son pantallas reales de la app. Claridad digital. Acompañamiento humano.</w:t>
       </w:r>
     </w:p>
     <w:p>
@@ -3756,7 +3770,7 @@
           <w:color w:val="65736D"/>
           <w:sz w:val="17"/>
         </w:rPr>
-        <w:t xml:space="preserve">Diapositiva 32 · [39:19 — 39:54]  </w:t>
+        <w:t xml:space="preserve">Diapositiva 32 · [39:39 — 40:49]  </w:t>
       </w:r>
       <w:r>
         <w:rPr>
@@ -3764,7 +3778,7 @@
           <w:color w:val="1C3B34"/>
           <w:sz w:val="25"/>
         </w:rPr>
-        <w:t>dreamnestspain.com</w:t>
+        <w:t>Para ustedes, los REALTORS®</w:t>
       </w:r>
     </w:p>
     <w:p>
@@ -3773,7 +3787,34 @@
           <w:rFonts w:ascii="Arial" w:hAnsi="Arial" w:cs="Arial" w:eastAsia="Arial"/>
           <w:sz w:val="21"/>
         </w:rPr>
-        <w:t>No tomen notas. Escaneen el QR.</w:t>
+        <w:t>Y esta es para ustedes.</w:t>
+      </w:r>
+    </w:p>
+    <w:p>
+      <w:r>
+        <w:rPr>
+          <w:rFonts w:ascii="Arial" w:hAnsi="Arial" w:cs="Arial" w:eastAsia="Arial"/>
+          <w:sz w:val="21"/>
+        </w:rPr>
+        <w:t>Nos presentan a un cliente... ¿y luego qué? Normalmente, silencio. Se preguntan si alguien le habrá llamado. Y no quieren ser quienes persiguen.</w:t>
+      </w:r>
+    </w:p>
+    <w:p>
+      <w:r>
+        <w:rPr>
+          <w:rFonts w:ascii="Arial" w:hAnsi="Arial" w:cs="Arial" w:eastAsia="Arial"/>
+          <w:sz w:val="21"/>
+        </w:rPr>
+        <w:t>Nosotros queremos justo lo contrario.</w:t>
+      </w:r>
+    </w:p>
+    <w:p>
+      <w:r>
+        <w:rPr>
+          <w:rFonts w:ascii="Arial" w:hAnsi="Arial" w:cs="Arial" w:eastAsia="Arial"/>
+          <w:sz w:val="21"/>
+        </w:rPr>
+        <w:t>Por eso hemos hecho la app de colaboradores. Ya está en marcha. Nos presentan a un cliente en segundos. Ven cómo avanza cada cliente, en sus dos caminos: la hipoteca y la vivienda. Saben cuándo hemos contactado con él. Tienen una lista de documentos por país para sus clientes, su propia página para compartir, y recursos sobre España y juegos. Y están informados sin perseguir a nadie.</w:t>
       </w:r>
     </w:p>
     <w:p>
@@ -3784,7 +3825,18 @@
           <w:color w:val="65736D"/>
           <w:sz w:val="19"/>
         </w:rPr>
-        <w:t>[Pausa. Dales unos segundos. Merece la pena.]</w:t>
+        <w:t>[Señalar los móviles: pantallas reales, datos de demostración.]</w:t>
+      </w:r>
+    </w:p>
+    <w:p>
+      <w:r>
+        <w:rPr>
+          <w:rFonts w:ascii="Arial" w:hAnsi="Arial" w:cs="Arial" w:eastAsia="Arial"/>
+          <w:i/>
+          <w:color w:val="65736D"/>
+          <w:sz w:val="19"/>
+        </w:rPr>
+        <w:t>[Despacio. Con firmeza.]</w:t>
       </w:r>
     </w:p>
     <w:p>
@@ -3793,7 +3845,7 @@
           <w:rFonts w:ascii="Arial" w:hAnsi="Arial" w:cs="Arial" w:eastAsia="Arial"/>
           <w:sz w:val="21"/>
         </w:rPr>
-        <w:t>Todo lo que he contado hoy está en la web, en siete idiomas. La hoja de ruta en seis preguntas. La calculadora hipotecaria y los gastos de compra por comunidad. Las guías. Y un dosier del proyecto, personalizado y gratuito.</w:t>
+        <w:t>Y hay una línea roja. La información financiera de su cliente es privada. Nunca compartimos sus ingresos, su patrimonio, sus deudas, sus documentos bancarios ni su información crediticia.</w:t>
       </w:r>
     </w:p>
     <w:p>
@@ -3802,7 +3854,16 @@
           <w:rFonts w:ascii="Arial" w:hAnsi="Arial" w:cs="Arial" w:eastAsia="Arial"/>
           <w:sz w:val="21"/>
         </w:rPr>
-        <w:t>Cuando un cliente diga «España», pueden mandarle ahí. O, mejor todavía... mandárnoslo a nosotros.</w:t>
+        <w:t>Ustedes ven el servicio. No sus finanzas.</w:t>
+      </w:r>
+    </w:p>
+    <w:p>
+      <w:r>
+        <w:rPr>
+          <w:rFonts w:ascii="Arial" w:hAnsi="Arial" w:cs="Arial" w:eastAsia="Arial"/>
+          <w:sz w:val="21"/>
+        </w:rPr>
+        <w:t>Eso protege a su cliente. Y, sinceramente, también protege la relación que ustedes tienen con él.</w:t>
       </w:r>
     </w:p>
     <w:p>
@@ -3820,7 +3881,7 @@
           <w:color w:val="65736D"/>
           <w:sz w:val="17"/>
         </w:rPr>
-        <w:t xml:space="preserve">Diapositiva 33 · [39:54 — 40:46]  </w:t>
+        <w:t xml:space="preserve">Diapositiva 33 · [40:49 — 41:24]  </w:t>
       </w:r>
       <w:r>
         <w:rPr>
@@ -3828,7 +3889,7 @@
           <w:color w:val="1C3B34"/>
           <w:sz w:val="25"/>
         </w:rPr>
-        <w:t>De «¿me dan la hipoteca?» a la estrategia de compra</w:t>
+        <w:t>dreamnestspain.com</w:t>
       </w:r>
     </w:p>
     <w:p>
@@ -3837,34 +3898,7 @@
           <w:rFonts w:ascii="Arial" w:hAnsi="Arial" w:cs="Arial" w:eastAsia="Arial"/>
           <w:sz w:val="21"/>
         </w:rPr>
-        <w:t>Cuando tenemos la foto completa, los documentos, los objetivos, la vivienda, los plazos, podemos hacer mucho más que conseguir una oferta.</w:t>
-      </w:r>
-    </w:p>
-    <w:p>
-      <w:r>
-        <w:rPr>
-          <w:rFonts w:ascii="Arial" w:hAnsi="Arial" w:cs="Arial" w:eastAsia="Arial"/>
-          <w:sz w:val="21"/>
-        </w:rPr>
-        <w:t>La pregunta cambia. Deja de ser «¿me dan la hipoteca?» y pasa a ser «¿cuál es el plan adecuado?».</w:t>
-      </w:r>
-    </w:p>
-    <w:p>
-      <w:r>
-        <w:rPr>
-          <w:rFonts w:ascii="Arial" w:hAnsi="Arial" w:cs="Arial" w:eastAsia="Arial"/>
-          <w:sz w:val="21"/>
-        </w:rPr>
-        <w:t>¿Cuánto debería comprar? ¿Cuánto financiar? ¿Cuánto dinero guardar? ¿Compro ya o me preparo antes? ¿Compro antes o después de mudarme? ¿Esta vivienda me resulta cómoda? No solo posible. Cómoda.</w:t>
-      </w:r>
-    </w:p>
-    <w:p>
-      <w:r>
-        <w:rPr>
-          <w:rFonts w:ascii="Arial" w:hAnsi="Arial" w:cs="Arial" w:eastAsia="Arial"/>
-          <w:sz w:val="21"/>
-        </w:rPr>
-        <w:t>Son las preguntas en las que ayudamos a los clientes. La decisión siempre es suya.</w:t>
+        <w:t>No tomen notas. Escaneen el QR.</w:t>
       </w:r>
     </w:p>
     <w:p>
@@ -3875,7 +3909,25 @@
           <w:color w:val="65736D"/>
           <w:sz w:val="19"/>
         </w:rPr>
-        <w:t>[Quedarse en las preguntas. Sin prometer resultados.]</w:t>
+        <w:t>[Pausa. Dales unos segundos. Merece la pena.]</w:t>
+      </w:r>
+    </w:p>
+    <w:p>
+      <w:r>
+        <w:rPr>
+          <w:rFonts w:ascii="Arial" w:hAnsi="Arial" w:cs="Arial" w:eastAsia="Arial"/>
+          <w:sz w:val="21"/>
+        </w:rPr>
+        <w:t>Todo lo que he contado hoy está en la web, en siete idiomas. La hoja de ruta en seis preguntas. La calculadora hipotecaria y los gastos de compra por comunidad. Las guías. Y un dosier del proyecto, personalizado y gratuito.</w:t>
+      </w:r>
+    </w:p>
+    <w:p>
+      <w:r>
+        <w:rPr>
+          <w:rFonts w:ascii="Arial" w:hAnsi="Arial" w:cs="Arial" w:eastAsia="Arial"/>
+          <w:sz w:val="21"/>
+        </w:rPr>
+        <w:t>Cuando un cliente diga «España», pueden mandarle ahí. O, mejor todavía... mandárnoslo a nosotros.</w:t>
       </w:r>
     </w:p>
     <w:p>
@@ -3893,7 +3945,7 @@
           <w:color w:val="65736D"/>
           <w:sz w:val="17"/>
         </w:rPr>
-        <w:t xml:space="preserve">Diapositiva 34 · [40:46 — 41:21]  </w:t>
+        <w:t xml:space="preserve">Diapositiva 34 · [41:24 — 42:16]  </w:t>
       </w:r>
       <w:r>
         <w:rPr>
@@ -3901,7 +3953,7 @@
           <w:color w:val="1C3B34"/>
           <w:sz w:val="25"/>
         </w:rPr>
-        <w:t>Dream Nest Signature</w:t>
+        <w:t>De «¿me dan la hipoteca?» a la estrategia de compra</w:t>
       </w:r>
     </w:p>
     <w:p>
@@ -3910,7 +3962,7 @@
           <w:rFonts w:ascii="Arial" w:hAnsi="Arial" w:cs="Arial" w:eastAsia="Arial"/>
           <w:sz w:val="21"/>
         </w:rPr>
-        <w:t>Para algunos clientes, el proyecto es más grande que una hipoteca. Por eso creamos Dream Nest Signature.</w:t>
+        <w:t>Cuando tenemos la foto completa, los documentos, los objetivos, la vivienda, los plazos, podemos hacer mucho más que conseguir una oferta.</w:t>
       </w:r>
     </w:p>
     <w:p>
@@ -3919,7 +3971,7 @@
           <w:rFonts w:ascii="Arial" w:hAnsi="Arial" w:cs="Arial" w:eastAsia="Arial"/>
           <w:sz w:val="21"/>
         </w:rPr>
-        <w:t>Es nuestra capa más completa de estrategia y acompañamiento: financiación, el proyecto inmobiliario, la estructura de compra, los profesionales, la coordinación. Con la hipoteca como núcleo técnico y regulado.</w:t>
+        <w:t>La pregunta cambia. Deja de ser «¿me dan la hipoteca?» y pasa a ser «¿cuál es el plan adecuado?».</w:t>
       </w:r>
     </w:p>
     <w:p>
@@ -3928,7 +3980,7 @@
           <w:rFonts w:ascii="Arial" w:hAnsi="Arial" w:cs="Arial" w:eastAsia="Arial"/>
           <w:sz w:val="21"/>
         </w:rPr>
-        <w:t>Toda la idea cabe en dos preguntas.</w:t>
+        <w:t>¿Cuánto debería comprar? ¿Cuánto financiar? ¿Cuánto dinero guardar? ¿Compro ya o me preparo antes? ¿Compro antes o después de mudarme? ¿Esta vivienda me resulta cómoda? No solo posible. Cómoda.</w:t>
       </w:r>
     </w:p>
     <w:p>
@@ -3937,7 +3989,7 @@
           <w:rFonts w:ascii="Arial" w:hAnsi="Arial" w:cs="Arial" w:eastAsia="Arial"/>
           <w:sz w:val="21"/>
         </w:rPr>
-        <w:t>No solo preguntamos: «¿Puede el banco financiar esto?»</w:t>
+        <w:t>Son las preguntas en las que ayudamos a los clientes. La decisión siempre es suya.</w:t>
       </w:r>
     </w:p>
     <w:p>
@@ -3948,16 +4000,7 @@
           <w:color w:val="65736D"/>
           <w:sz w:val="19"/>
         </w:rPr>
-        <w:t>[Despacio.]</w:t>
-      </w:r>
-    </w:p>
-    <w:p>
-      <w:r>
-        <w:rPr>
-          <w:rFonts w:ascii="Arial" w:hAnsi="Arial" w:cs="Arial" w:eastAsia="Arial"/>
-          <w:sz w:val="21"/>
-        </w:rPr>
-        <w:t>Preguntamos: «¿Tiene sentido todo este proyecto para este cliente?»</w:t>
+        <w:t>[Quedarse en las preguntas. Sin prometer resultados.]</w:t>
       </w:r>
     </w:p>
     <w:p>
@@ -3975,7 +4018,7 @@
           <w:color w:val="65736D"/>
           <w:sz w:val="17"/>
         </w:rPr>
-        <w:t xml:space="preserve">Diapositiva 35 · [41:21 — 41:56]  </w:t>
+        <w:t xml:space="preserve">Diapositiva 35 · [42:16 — 42:51]  </w:t>
       </w:r>
       <w:r>
         <w:rPr>
@@ -3983,7 +4026,43 @@
           <w:color w:val="1C3B34"/>
           <w:sz w:val="25"/>
         </w:rPr>
-        <w:t>Su cliente no deja de ser su cliente</w:t>
+        <w:t>Dream Nest Signature</w:t>
+      </w:r>
+    </w:p>
+    <w:p>
+      <w:r>
+        <w:rPr>
+          <w:rFonts w:ascii="Arial" w:hAnsi="Arial" w:cs="Arial" w:eastAsia="Arial"/>
+          <w:sz w:val="21"/>
+        </w:rPr>
+        <w:t>Para algunos clientes, el proyecto es más grande que una hipoteca. Por eso creamos Dream Nest Signature.</w:t>
+      </w:r>
+    </w:p>
+    <w:p>
+      <w:r>
+        <w:rPr>
+          <w:rFonts w:ascii="Arial" w:hAnsi="Arial" w:cs="Arial" w:eastAsia="Arial"/>
+          <w:sz w:val="21"/>
+        </w:rPr>
+        <w:t>Es nuestra capa más completa de estrategia y acompañamiento: financiación, el proyecto inmobiliario, la estructura de compra, los profesionales, la coordinación. Con la hipoteca como núcleo técnico y regulado.</w:t>
+      </w:r>
+    </w:p>
+    <w:p>
+      <w:r>
+        <w:rPr>
+          <w:rFonts w:ascii="Arial" w:hAnsi="Arial" w:cs="Arial" w:eastAsia="Arial"/>
+          <w:sz w:val="21"/>
+        </w:rPr>
+        <w:t>Toda la idea cabe en dos preguntas.</w:t>
+      </w:r>
+    </w:p>
+    <w:p>
+      <w:r>
+        <w:rPr>
+          <w:rFonts w:ascii="Arial" w:hAnsi="Arial" w:cs="Arial" w:eastAsia="Arial"/>
+          <w:sz w:val="21"/>
+        </w:rPr>
+        <w:t>No solo preguntamos: «¿Puede el banco financiar esto?»</w:t>
       </w:r>
     </w:p>
     <w:p>
@@ -3994,7 +4073,7 @@
           <w:color w:val="65736D"/>
           <w:sz w:val="19"/>
         </w:rPr>
-        <w:t>[Mira a la sala. Es el corazón emocional de la charla.]</w:t>
+        <w:t>[Despacio.]</w:t>
       </w:r>
     </w:p>
     <w:p>
@@ -4003,34 +4082,7 @@
           <w:rFonts w:ascii="Arial" w:hAnsi="Arial" w:cs="Arial" w:eastAsia="Arial"/>
           <w:sz w:val="21"/>
         </w:rPr>
-        <w:t>Ustedes han pasado años construyendo la relación con su cliente.</w:t>
-      </w:r>
-    </w:p>
-    <w:p>
-      <w:r>
-        <w:rPr>
-          <w:rFonts w:ascii="Arial" w:hAnsi="Arial" w:cs="Arial" w:eastAsia="Arial"/>
-          <w:sz w:val="21"/>
-        </w:rPr>
-        <w:t>Cuando empieza a soñar con España, no tienen que soltarlo. Y tampoco tienen que convertirse en expertos en banca española.</w:t>
-      </w:r>
-    </w:p>
-    <w:p>
-      <w:r>
-        <w:rPr>
-          <w:rFonts w:ascii="Arial" w:hAnsi="Arial" w:cs="Arial" w:eastAsia="Arial"/>
-          <w:sz w:val="21"/>
-        </w:rPr>
-        <w:t>Su cliente no deja de ser su cliente porque cruce el Atlántico.</w:t>
-      </w:r>
-    </w:p>
-    <w:p>
-      <w:r>
-        <w:rPr>
-          <w:rFonts w:ascii="Arial" w:hAnsi="Arial" w:cs="Arial" w:eastAsia="Arial"/>
-          <w:sz w:val="21"/>
-        </w:rPr>
-        <w:t>Llámennos para esa conversación. Ustedes siguen siendo su persona de confianza. Nosotros somos su equipo en España.</w:t>
+        <w:t>Preguntamos: «¿Tiene sentido todo este proyecto para este cliente?»</w:t>
       </w:r>
     </w:p>
     <w:p>
@@ -4048,7 +4100,7 @@
           <w:color w:val="65736D"/>
           <w:sz w:val="17"/>
         </w:rPr>
-        <w:t xml:space="preserve">Diapositiva 36 · [41:56 — 42:13]  </w:t>
+        <w:t xml:space="preserve">Diapositiva 36 · [42:51 — 43:26]  </w:t>
       </w:r>
       <w:r>
         <w:rPr>
@@ -4056,7 +4108,7 @@
           <w:color w:val="1C3B34"/>
           <w:sz w:val="25"/>
         </w:rPr>
-        <w:t>Llamen pronto a Dream Nest</w:t>
+        <w:t>Su cliente no deja de ser su cliente</w:t>
       </w:r>
     </w:p>
     <w:p>
@@ -4067,7 +4119,7 @@
           <w:color w:val="65736D"/>
           <w:sz w:val="19"/>
         </w:rPr>
-        <w:t>[Corto y firme.]</w:t>
+        <w:t>[Mira a la sala. Es el corazón emocional de la charla.]</w:t>
       </w:r>
     </w:p>
     <w:p>
@@ -4076,7 +4128,7 @@
           <w:rFonts w:ascii="Arial" w:hAnsi="Arial" w:cs="Arial" w:eastAsia="Arial"/>
           <w:sz w:val="21"/>
         </w:rPr>
-        <w:t>Así que llámennos pronto.</w:t>
+        <w:t>Ustedes han pasado años construyendo la relación con su cliente.</w:t>
       </w:r>
     </w:p>
     <w:p>
@@ -4085,7 +4137,7 @@
           <w:rFonts w:ascii="Arial" w:hAnsi="Arial" w:cs="Arial" w:eastAsia="Arial"/>
           <w:sz w:val="21"/>
         </w:rPr>
-        <w:t>No en la notaría. En el primer «¿y si España?».</w:t>
+        <w:t>Cuando empieza a soñar con España, no tienen que soltarlo. Y tampoco tienen que convertirse en expertos en banca española.</w:t>
       </w:r>
     </w:p>
     <w:p>
@@ -4094,7 +4146,16 @@
           <w:rFonts w:ascii="Arial" w:hAnsi="Arial" w:cs="Arial" w:eastAsia="Arial"/>
           <w:sz w:val="21"/>
         </w:rPr>
-        <w:t>Nuestro mejor trabajo no es arreglar una operación complicada. Es ayudar a construir bien el proyecto desde el principio.</w:t>
+        <w:t>Su cliente no deja de ser su cliente porque cruce el Atlántico.</w:t>
+      </w:r>
+    </w:p>
+    <w:p>
+      <w:r>
+        <w:rPr>
+          <w:rFonts w:ascii="Arial" w:hAnsi="Arial" w:cs="Arial" w:eastAsia="Arial"/>
+          <w:sz w:val="21"/>
+        </w:rPr>
+        <w:t>Llámennos para esa conversación. Ustedes siguen siendo su persona de confianza. Nosotros somos su equipo en España.</w:t>
       </w:r>
     </w:p>
     <w:p>
@@ -4112,7 +4173,7 @@
           <w:color w:val="65736D"/>
           <w:sz w:val="17"/>
         </w:rPr>
-        <w:t xml:space="preserve">Diapositiva 37 · [42:13 — 43:43]  </w:t>
+        <w:t xml:space="preserve">Diapositiva 37 · [43:26 — 43:43]  </w:t>
       </w:r>
       <w:r>
         <w:rPr>
@@ -4120,7 +4181,7 @@
           <w:color w:val="1C3B34"/>
           <w:sz w:val="25"/>
         </w:rPr>
-        <w:t>La guía que se llevan · cara 1</w:t>
+        <w:t>Llamen pronto a Dream Nest</w:t>
       </w:r>
     </w:p>
     <w:p>
@@ -4131,7 +4192,7 @@
           <w:color w:val="65736D"/>
           <w:sz w:val="19"/>
         </w:rPr>
-        <w:t>[Levantar el folleto impreso.]</w:t>
+        <w:t>[Corto y firme.]</w:t>
       </w:r>
     </w:p>
     <w:p>
@@ -4140,7 +4201,7 @@
           <w:rFonts w:ascii="Arial" w:hAnsi="Arial" w:cs="Arial" w:eastAsia="Arial"/>
           <w:sz w:val="21"/>
         </w:rPr>
-        <w:t>Antes de jugar, la guía que se llevan hoy a casa. Denle la vuelta conmigo.</w:t>
+        <w:t>Así que llámennos pronto.</w:t>
       </w:r>
     </w:p>
     <w:p>
@@ -4149,18 +4210,16 @@
           <w:rFonts w:ascii="Arial" w:hAnsi="Arial" w:cs="Arial" w:eastAsia="Arial"/>
           <w:sz w:val="21"/>
         </w:rPr>
-        <w:t>En esta cara: quiénes somos. Qué tipo de comprador es su cliente: segunda residencia o inversión, o alguien que se muda a vivir y trabajar en España. El Financial &amp; Lifestyle Dossier, veinte páginas, gratuito. Lo que dicen nuestros clientes. Y el QR para empezar.</w:t>
-      </w:r>
-    </w:p>
-    <w:p>
-      <w:r>
-        <w:rPr>
-          <w:rFonts w:ascii="Arial" w:hAnsi="Arial" w:cs="Arial" w:eastAsia="Arial"/>
-          <w:i/>
-          <w:color w:val="65736D"/>
-          <w:sz w:val="19"/>
-        </w:rPr>
-        <w:t>[Los porcentajes: máximos orientativos, siempre según perfil, tasación y banco. ⚠️ LCCI/Orden EHA/2899/2011]</w:t>
+        <w:t>No en la notaría. En el primer «¿y si España?».</w:t>
+      </w:r>
+    </w:p>
+    <w:p>
+      <w:r>
+        <w:rPr>
+          <w:rFonts w:ascii="Arial" w:hAnsi="Arial" w:cs="Arial" w:eastAsia="Arial"/>
+          <w:sz w:val="21"/>
+        </w:rPr>
+        <w:t>Nuestro mejor trabajo no es arreglar una operación complicada. Es ayudar a construir bien el proyecto desde el principio.</w:t>
       </w:r>
     </w:p>
     <w:p>
@@ -4186,7 +4245,18 @@
           <w:color w:val="1C3B34"/>
           <w:sz w:val="25"/>
         </w:rPr>
-        <w:t>La hoja de ruta, en grande</w:t>
+        <w:t>La guía que se llevan · cara 1</w:t>
+      </w:r>
+    </w:p>
+    <w:p>
+      <w:r>
+        <w:rPr>
+          <w:rFonts w:ascii="Arial" w:hAnsi="Arial" w:cs="Arial" w:eastAsia="Arial"/>
+          <w:i/>
+          <w:color w:val="65736D"/>
+          <w:sz w:val="19"/>
+        </w:rPr>
+        <w:t>[Levantar el folleto impreso.]</w:t>
       </w:r>
     </w:p>
     <w:p>
@@ -4195,7 +4265,7 @@
           <w:rFonts w:ascii="Arial" w:hAnsi="Arial" w:cs="Arial" w:eastAsia="Arial"/>
           <w:sz w:val="21"/>
         </w:rPr>
-        <w:t>Y así trabajamos, desde la primera conversación hasta la puerta de casa, y después.</w:t>
+        <w:t>Antes de jugar, la guía que se llevan hoy a casa. Denle la vuelta conmigo.</w:t>
       </w:r>
     </w:p>
     <w:p>
@@ -4204,16 +4274,18 @@
           <w:rFonts w:ascii="Arial" w:hAnsi="Arial" w:cs="Arial" w:eastAsia="Arial"/>
           <w:sz w:val="21"/>
         </w:rPr>
-        <w:t>Planificar. Preparar. Descubrir. Proteger. Firmar. Unos tres o cuatro meses, según el cliente, la vivienda y el banco.</w:t>
-      </w:r>
-    </w:p>
-    <w:p>
-      <w:r>
-        <w:rPr>
-          <w:rFonts w:ascii="Arial" w:hAnsi="Arial" w:cs="Arial" w:eastAsia="Arial"/>
-          <w:sz w:val="21"/>
-        </w:rPr>
-        <w:t>La palabra más importante aquí es «primero». Primero, la financiación. Comprobamos que la vivienda se puede financiar antes de que su cliente la reserve. No todas se pueden.</w:t>
+        <w:t>En esta cara: quiénes somos. Qué tipo de comprador es su cliente: segunda residencia o inversión, o alguien que se muda a vivir y trabajar en España. El Financial &amp; Lifestyle Dossier, veinte páginas, gratuito. Lo que dicen nuestros clientes. Y el QR para empezar.</w:t>
+      </w:r>
+    </w:p>
+    <w:p>
+      <w:r>
+        <w:rPr>
+          <w:rFonts w:ascii="Arial" w:hAnsi="Arial" w:cs="Arial" w:eastAsia="Arial"/>
+          <w:i/>
+          <w:color w:val="65736D"/>
+          <w:sz w:val="19"/>
+        </w:rPr>
+        <w:t>[Los porcentajes: máximos orientativos, siempre según perfil, tasación y banco. ⚠️ LCCI/Orden EHA/2899/2011]</w:t>
       </w:r>
     </w:p>
     <w:p>
@@ -4231,7 +4303,7 @@
           <w:color w:val="65736D"/>
           <w:sz w:val="17"/>
         </w:rPr>
-        <w:t xml:space="preserve">Diapositiva 39 · [45:13 — 49:13]  </w:t>
+        <w:t xml:space="preserve">Diapositiva 39 · [45:13 — 46:43]  </w:t>
       </w:r>
       <w:r>
         <w:rPr>
@@ -4239,18 +4311,7 @@
           <w:color w:val="1C3B34"/>
           <w:sz w:val="25"/>
         </w:rPr>
-        <w:t>España: un lugar al que pertenecer · cara 2</w:t>
-      </w:r>
-    </w:p>
-    <w:p>
-      <w:r>
-        <w:rPr>
-          <w:rFonts w:ascii="Arial" w:hAnsi="Arial" w:cs="Arial" w:eastAsia="Arial"/>
-          <w:i/>
-          <w:color w:val="65736D"/>
-          <w:sz w:val="19"/>
-        </w:rPr>
-        <w:t>[Dar la vuelta al folleto.]</w:t>
+        <w:t>La hoja de ruta, en grande</w:t>
       </w:r>
     </w:p>
     <w:p>
@@ -4259,7 +4320,7 @@
           <w:rFonts w:ascii="Arial" w:hAnsi="Arial" w:cs="Arial" w:eastAsia="Arial"/>
           <w:sz w:val="21"/>
         </w:rPr>
-        <w:t>Y en la otra cara, lo que más me gusta. España.</w:t>
+        <w:t>Y así trabajamos, desde la primera conversación hasta la puerta de casa, y después.</w:t>
       </w:r>
     </w:p>
     <w:p>
@@ -4268,18 +4329,7 @@
           <w:rFonts w:ascii="Arial" w:hAnsi="Arial" w:cs="Arial" w:eastAsia="Arial"/>
           <w:sz w:val="21"/>
         </w:rPr>
-        <w:t>Un país, muchas formas de vivir, en unos mil kilómetros. Montañas, pueblos, islas, costa y ciudades.</w:t>
-      </w:r>
-    </w:p>
-    <w:p>
-      <w:r>
-        <w:rPr>
-          <w:rFonts w:ascii="Arial" w:hAnsi="Arial" w:cs="Arial" w:eastAsia="Arial"/>
-          <w:i/>
-          <w:color w:val="65736D"/>
-          <w:sz w:val="19"/>
-        </w:rPr>
-        <w:t>[MIS ZONAS: tres o cuatro sitios, qué tiene cada uno de especial y para quién encaja. Ningún precio sin fuente.]</w:t>
+        <w:t>Planificar. Preparar. Descubrir. Proteger. Firmar. Unos tres o cuatro meses, según el cliente, la vivienda y el banco.</w:t>
       </w:r>
     </w:p>
     <w:p>
@@ -4288,7 +4338,7 @@
           <w:rFonts w:ascii="Arial" w:hAnsi="Arial" w:cs="Arial" w:eastAsia="Arial"/>
           <w:sz w:val="21"/>
         </w:rPr>
-        <w:t>¿Con qué sitio sueñan sus clientes? Díganme uno.</w:t>
+        <w:t>La palabra más importante aquí es «primero». Primero, la financiación. Comprobamos que la vivienda se puede financiar antes de que su cliente la reserve. No todas se pueden.</w:t>
       </w:r>
     </w:p>
     <w:p>
@@ -4306,7 +4356,7 @@
           <w:color w:val="65736D"/>
           <w:sz w:val="17"/>
         </w:rPr>
-        <w:t xml:space="preserve">Diapositiva 40 · [49:13 — 57:13]  </w:t>
+        <w:t xml:space="preserve">Diapositiva 40 · [46:43 — 50:43]  </w:t>
       </w:r>
       <w:r>
         <w:rPr>
@@ -4314,7 +4364,7 @@
           <w:color w:val="1C3B34"/>
           <w:sz w:val="25"/>
         </w:rPr>
-        <w:t>Hora de jugar · en directo desde el teléfono</w:t>
+        <w:t>España: un lugar al que pertenecer · cara 2</w:t>
       </w:r>
     </w:p>
     <w:p>
@@ -4325,7 +4375,7 @@
           <w:color w:val="65736D"/>
           <w:sz w:val="19"/>
         </w:rPr>
-        <w:t>[Sube la energía.]</w:t>
+        <w:t>[Dar la vuelta al folleto.]</w:t>
       </w:r>
     </w:p>
     <w:p>
@@ -4334,7 +4384,7 @@
           <w:rFonts w:ascii="Arial" w:hAnsi="Arial" w:cs="Arial" w:eastAsia="Arial"/>
           <w:sz w:val="21"/>
         </w:rPr>
-        <w:t>Y ahora... saquen el teléfono. Hora de jugar.</w:t>
+        <w:t>Y en la otra cara, lo que más me gusta. España.</w:t>
       </w:r>
     </w:p>
     <w:p>
@@ -4343,16 +4393,7 @@
           <w:rFonts w:ascii="Arial" w:hAnsi="Arial" w:cs="Arial" w:eastAsia="Arial"/>
           <w:sz w:val="21"/>
         </w:rPr>
-        <w:t>Todo lo que hemos visto hoy, ahora en su teléfono. Acertar da puntos. Acertar rápido, más.</w:t>
-      </w:r>
-    </w:p>
-    <w:p>
-      <w:r>
-        <w:rPr>
-          <w:rFonts w:ascii="Arial" w:hAnsi="Arial" w:cs="Arial" w:eastAsia="Arial"/>
-          <w:sz w:val="21"/>
-        </w:rPr>
-        <w:t>Vamos a ver quién consigue llevar a su cliente hasta las llaves.</w:t>
+        <w:t>Un país, muchas formas de vivir, en unos mil kilómetros. Montañas, pueblos, islas, costa y ciudades.</w:t>
       </w:r>
     </w:p>
     <w:p>
@@ -4363,18 +4404,7 @@
           <w:color w:val="65736D"/>
           <w:sz w:val="19"/>
         </w:rPr>
-        <w:t>[Abre el juego: pulsa «Abrir el juego» en esta diapositiva, o cambia a la pestaña del navegador que abriste antes de la charla. Esa página es la pantalla grande: muestra el QR, el PIN y cada nombre que entra. La voz sale del portátil: comprueba que el sonido va a los altavoces de la sala.]</w:t>
-      </w:r>
-    </w:p>
-    <w:p>
-      <w:r>
-        <w:rPr>
-          <w:rFonts w:ascii="Arial" w:hAnsi="Arial" w:cs="Arial" w:eastAsia="Arial"/>
-          <w:i/>
-          <w:color w:val="65736D"/>
-          <w:sz w:val="19"/>
-        </w:rPr>
-        <w:t>[Antes de la charla, abre dreamnestspain.com/games/live?host=1 en el portátil (la primera vez pide el código de presentador), elige «Colaboradores internacionales», Español, 12 preguntas, 25 segundos.]</w:t>
+        <w:t>[MIS ZONAS: tres o cuatro sitios, qué tiene cada uno de especial y para quién encaja. Ningún precio sin fuente.]</w:t>
       </w:r>
     </w:p>
     <w:p>
@@ -4383,69 +4413,7 @@
           <w:rFonts w:ascii="Arial" w:hAnsi="Arial" w:cs="Arial" w:eastAsia="Arial"/>
           <w:sz w:val="21"/>
         </w:rPr>
-        <w:t>Escaneen el QR, escriban el PIN y elijan un nombre. Uno que aprobarían sus clientes, por favor.</w:t>
-      </w:r>
-    </w:p>
-    <w:p>
-      <w:r>
-        <w:rPr>
-          <w:rFonts w:ascii="Arial" w:hAnsi="Arial" w:cs="Arial" w:eastAsia="Arial"/>
-          <w:i/>
-          <w:color w:val="65736D"/>
-          <w:sz w:val="19"/>
-        </w:rPr>
-        <w:t>[Mientras entran nombres, lee algunos en voz alta y dales la bienvenida. Cuando dejen de llegar, pulsa Start the game, o la barra espaciadora.]</w:t>
-      </w:r>
-    </w:p>
-    <w:p>
-      <w:r>
-        <w:rPr>
-          <w:rFonts w:ascii="Arial" w:hAnsi="Arial" w:cs="Arial" w:eastAsia="Arial"/>
-          <w:i/>
-          <w:color w:val="65736D"/>
-          <w:sz w:val="19"/>
-        </w:rPr>
-        <w:t>[En la pantalla de inicio del juego pulsa «Español». Cada jugador puede cambiar el idioma en su teléfono con el botón EN/ES. Recomendado: 12 preguntas, 20 segundos, voz activada, sin equipos. La barra espaciadora avanza.]</w:t>
-      </w:r>
-    </w:p>
-    <w:p>
-      <w:r>
-        <w:rPr>
-          <w:rFonts w:ascii="Arial" w:hAnsi="Arial" w:cs="Arial" w:eastAsia="Arial"/>
-          <w:i/>
-          <w:color w:val="65736D"/>
-          <w:sz w:val="19"/>
-        </w:rPr>
-        <w:t>[Durante el juego, tono ligero: comenta el ranking, celebra las respuestas rápidas y, cuando la sala falle una, explica el porqué en una frase.]</w:t>
-      </w:r>
-    </w:p>
-    <w:p>
-      <w:r>
-        <w:rPr>
-          <w:rFonts w:ascii="Arial" w:hAnsi="Arial" w:cs="Arial" w:eastAsia="Arial"/>
-          <w:i/>
-          <w:color w:val="65736D"/>
-          <w:sz w:val="19"/>
-        </w:rPr>
-        <w:t>[Tras el podio:]</w:t>
-      </w:r>
-      <w:r>
-        <w:rPr>
-          <w:rFonts w:ascii="Arial" w:hAnsi="Arial" w:cs="Arial" w:eastAsia="Arial"/>
-          <w:sz w:val="21"/>
-        </w:rPr>
-        <w:t xml:space="preserve"> ¡Enhorabuena a los ganadores! Y a todos los demás: sus clientes están en muy buenas manos.</w:t>
-      </w:r>
-    </w:p>
-    <w:p>
-      <w:r>
-        <w:rPr>
-          <w:rFonts w:ascii="Arial" w:hAnsi="Arial" w:cs="Arial" w:eastAsia="Arial"/>
-          <w:i/>
-          <w:color w:val="65736D"/>
-          <w:sz w:val="19"/>
-        </w:rPr>
-        <w:t>[Si la conexión fallara, juega igualmente en la pantalla grande y deja que la sala responda a mano alzada. Después vuelve a la presentación para la diapositiva final.]</w:t>
+        <w:t>¿Con qué sitio sueñan sus clientes? Díganme uno.</w:t>
       </w:r>
     </w:p>
     <w:p>
@@ -4463,7 +4431,164 @@
           <w:color w:val="65736D"/>
           <w:sz w:val="17"/>
         </w:rPr>
-        <w:t xml:space="preserve">Diapositiva 41 · [57:13 — 58:13]  </w:t>
+        <w:t xml:space="preserve">Diapositiva 41 · [50:43 — 58:43]  </w:t>
+      </w:r>
+      <w:r>
+        <w:rPr>
+          <w:rFonts w:ascii="Georgia" w:hAnsi="Georgia" w:cs="Georgia" w:eastAsia="Georgia"/>
+          <w:color w:val="1C3B34"/>
+          <w:sz w:val="25"/>
+        </w:rPr>
+        <w:t>Hora de jugar · en directo desde el teléfono</w:t>
+      </w:r>
+    </w:p>
+    <w:p>
+      <w:r>
+        <w:rPr>
+          <w:rFonts w:ascii="Arial" w:hAnsi="Arial" w:cs="Arial" w:eastAsia="Arial"/>
+          <w:i/>
+          <w:color w:val="65736D"/>
+          <w:sz w:val="19"/>
+        </w:rPr>
+        <w:t>[Sube la energía.]</w:t>
+      </w:r>
+    </w:p>
+    <w:p>
+      <w:r>
+        <w:rPr>
+          <w:rFonts w:ascii="Arial" w:hAnsi="Arial" w:cs="Arial" w:eastAsia="Arial"/>
+          <w:sz w:val="21"/>
+        </w:rPr>
+        <w:t>Y ahora... saquen el teléfono. Hora de jugar.</w:t>
+      </w:r>
+    </w:p>
+    <w:p>
+      <w:r>
+        <w:rPr>
+          <w:rFonts w:ascii="Arial" w:hAnsi="Arial" w:cs="Arial" w:eastAsia="Arial"/>
+          <w:sz w:val="21"/>
+        </w:rPr>
+        <w:t>Todo lo que hemos visto hoy, ahora en su teléfono. Acertar da puntos. Acertar rápido, más.</w:t>
+      </w:r>
+    </w:p>
+    <w:p>
+      <w:r>
+        <w:rPr>
+          <w:rFonts w:ascii="Arial" w:hAnsi="Arial" w:cs="Arial" w:eastAsia="Arial"/>
+          <w:sz w:val="21"/>
+        </w:rPr>
+        <w:t>Vamos a ver quién consigue llevar a su cliente hasta las llaves.</w:t>
+      </w:r>
+    </w:p>
+    <w:p>
+      <w:r>
+        <w:rPr>
+          <w:rFonts w:ascii="Arial" w:hAnsi="Arial" w:cs="Arial" w:eastAsia="Arial"/>
+          <w:i/>
+          <w:color w:val="65736D"/>
+          <w:sz w:val="19"/>
+        </w:rPr>
+        <w:t>[Abre el juego: pulsa «Abrir el juego» en esta diapositiva, o cambia a la pestaña del navegador que abriste antes de la charla. Esa página es la pantalla grande: muestra el QR, el PIN y cada nombre que entra. La voz sale del portátil: comprueba que el sonido va a los altavoces de la sala.]</w:t>
+      </w:r>
+    </w:p>
+    <w:p>
+      <w:r>
+        <w:rPr>
+          <w:rFonts w:ascii="Arial" w:hAnsi="Arial" w:cs="Arial" w:eastAsia="Arial"/>
+          <w:i/>
+          <w:color w:val="65736D"/>
+          <w:sz w:val="19"/>
+        </w:rPr>
+        <w:t>[Antes de la charla, abre dreamnestspain.com/games/live?host=1 en el portátil (la primera vez pide el código de presentador), elige «Colaboradores internacionales», Español, 12 preguntas, 25 segundos.]</w:t>
+      </w:r>
+    </w:p>
+    <w:p>
+      <w:r>
+        <w:rPr>
+          <w:rFonts w:ascii="Arial" w:hAnsi="Arial" w:cs="Arial" w:eastAsia="Arial"/>
+          <w:sz w:val="21"/>
+        </w:rPr>
+        <w:t>Escaneen el QR, escriban el PIN y elijan un nombre. Uno que aprobarían sus clientes, por favor.</w:t>
+      </w:r>
+    </w:p>
+    <w:p>
+      <w:r>
+        <w:rPr>
+          <w:rFonts w:ascii="Arial" w:hAnsi="Arial" w:cs="Arial" w:eastAsia="Arial"/>
+          <w:i/>
+          <w:color w:val="65736D"/>
+          <w:sz w:val="19"/>
+        </w:rPr>
+        <w:t>[Mientras entran nombres, lee algunos en voz alta y dales la bienvenida. Cuando dejen de llegar, pulsa Start the game, o la barra espaciadora.]</w:t>
+      </w:r>
+    </w:p>
+    <w:p>
+      <w:r>
+        <w:rPr>
+          <w:rFonts w:ascii="Arial" w:hAnsi="Arial" w:cs="Arial" w:eastAsia="Arial"/>
+          <w:i/>
+          <w:color w:val="65736D"/>
+          <w:sz w:val="19"/>
+        </w:rPr>
+        <w:t>[En la pantalla de inicio del juego pulsa «Español». Cada jugador puede cambiar el idioma en su teléfono con el botón EN/ES. Recomendado: 12 preguntas, 20 segundos, voz activada, sin equipos. La barra espaciadora avanza.]</w:t>
+      </w:r>
+    </w:p>
+    <w:p>
+      <w:r>
+        <w:rPr>
+          <w:rFonts w:ascii="Arial" w:hAnsi="Arial" w:cs="Arial" w:eastAsia="Arial"/>
+          <w:i/>
+          <w:color w:val="65736D"/>
+          <w:sz w:val="19"/>
+        </w:rPr>
+        <w:t>[Durante el juego, tono ligero: comenta el ranking, celebra las respuestas rápidas y, cuando la sala falle una, explica el porqué en una frase.]</w:t>
+      </w:r>
+    </w:p>
+    <w:p>
+      <w:r>
+        <w:rPr>
+          <w:rFonts w:ascii="Arial" w:hAnsi="Arial" w:cs="Arial" w:eastAsia="Arial"/>
+          <w:i/>
+          <w:color w:val="65736D"/>
+          <w:sz w:val="19"/>
+        </w:rPr>
+        <w:t>[Tras el podio:]</w:t>
+      </w:r>
+      <w:r>
+        <w:rPr>
+          <w:rFonts w:ascii="Arial" w:hAnsi="Arial" w:cs="Arial" w:eastAsia="Arial"/>
+          <w:sz w:val="21"/>
+        </w:rPr>
+        <w:t xml:space="preserve"> ¡Enhorabuena a los ganadores! Y a todos los demás: sus clientes están en muy buenas manos.</w:t>
+      </w:r>
+    </w:p>
+    <w:p>
+      <w:r>
+        <w:rPr>
+          <w:rFonts w:ascii="Arial" w:hAnsi="Arial" w:cs="Arial" w:eastAsia="Arial"/>
+          <w:i/>
+          <w:color w:val="65736D"/>
+          <w:sz w:val="19"/>
+        </w:rPr>
+        <w:t>[Si la conexión fallara, juega igualmente en la pantalla grande y deja que la sala responda a mano alzada. Después vuelve a la presentación para la diapositiva final.]</w:t>
+      </w:r>
+    </w:p>
+    <w:p>
+      <w:pPr>
+        <w:keepNext/>
+        <w:spacing w:before="200" w:after="80" w:line="276" w:lineRule="auto"/>
+        <w:pBdr>
+          <w:bottom w:val="single" w:sz="6" w:space="4" w:color="A7D5BD"/>
+        </w:pBdr>
+      </w:pPr>
+      <w:r>
+        <w:rPr>
+          <w:rFonts w:ascii="Arial" w:hAnsi="Arial" w:cs="Arial" w:eastAsia="Arial"/>
+          <w:b/>
+          <w:color w:val="65736D"/>
+          <w:sz w:val="17"/>
+        </w:rPr>
+        <w:t xml:space="preserve">Diapositiva 42 · [58:43 — 59:43]  </w:t>
       </w:r>
       <w:r>
         <w:rPr>

</xml_diff>